<commit_message>
Tulis ulang blok Founder sebagai job desc founder plus marketing
- Blok Terroir sekarang mencakup pendirian perusahaan, brand
  positioning, kepemilikan marketing penuh, operasi konten, pengarahan
  editor lepas, dan program konten acara
- Subjudul resume jadi Founder & Marketing Lead, summary disesuaikan
- Perluas kelompok skill marketing

Co-Authored-By: Claude Opus 5 <noreply@anthropic.com>
Claude-Session: https://claude.ai/code/session_01DWyspajaqx8W3wFxgo15X2
</commit_message>
<xml_diff>
--- a/cv/Resume - Dustin Wijaya (EN).docx
+++ b/cv/Resume - Dustin Wijaya (EN).docx
@@ -29,7 +29,7 @@
           <w:sz w:val="20"/>
           <w:szCs w:val="20"/>
         </w:rPr>
-        <w:t xml:space="preserve">Founder &amp; Content Strategist</w:t>
+        <w:t xml:space="preserve">Founder &amp; Marketing Lead</w:t>
       </w:r>
     </w:p>
     <w:p>
@@ -54,7 +54,7 @@
         </w:rPr>
         <w:t xml:space="preserve">   ·   [phone]   ·   West Jakarta, Indonesia   ·   </w:t>
       </w:r>
-      <w:hyperlink w:history="1" r:id="rIdz01rxrmrs8bvmtufrvsfj">
+      <w:hyperlink w:history="1" r:id="rIdfbtxxebvkzbcujioofp8l">
         <w:r>
           <w:rPr>
             <w:rFonts w:ascii="Calibri" w:cs="Calibri" w:eastAsia="Calibri" w:hAnsi="Calibri"/>
@@ -96,7 +96,7 @@
           <w:sz w:val="19"/>
           <w:szCs w:val="19"/>
         </w:rPr>
-        <w:t xml:space="preserve">Founder and content strategist with an analytical background in financial markets. Built and runs a specialty coffee company, owning brand positioning, editorial strategy and the full content pipeline from research question to published asset. Designs systems rather than one-off output: a documented evidence standard applied to every published claim, a repeatable script framework, and funnel-mapped programming reviewed weekly against tracked performance. Eight years of market analysis underpins a working habit of going to primary sources and testing a claim before publishing it.</w:t>
+        <w:t xml:space="preserve">Founder of a specialty coffee company, running marketing end to end alongside an analytical background in financial markets. Own brand positioning, channel strategy and the full content pipeline from research question to published asset. Build systems rather than one-off output: a documented evidence standard applied to every published claim, a repeatable script framework, and funnel-mapped programming reviewed weekly against tracked performance. Eight years of market analysis underpins a working habit of going to primary sources and testing a claim before publishing it.</w:t>
       </w:r>
     </w:p>
     <w:p>
@@ -170,121 +170,178 @@
           <w:sz w:val="19"/>
           <w:szCs w:val="19"/>
         </w:rPr>
-        <w:t xml:space="preserve">Own brand positioning, editorial strategy and the full content operation for a specialty coffee company.</w:t>
-      </w:r>
-    </w:p>
-    <w:p>
-      <w:pPr>
-        <w:pStyle w:val="ListParagraph"/>
-        <w:numPr>
-          <w:ilvl w:val="0"/>
-          <w:numId w:val="1"/>
-        </w:numPr>
-        <w:spacing w:after="50"/>
-      </w:pPr>
-      <w:r>
-        <w:rPr>
-          <w:rFonts w:ascii="Calibri" w:cs="Calibri" w:eastAsia="Calibri" w:hAnsi="Calibri"/>
-          <w:color w:val="2B2B2B"/>
-          <w:sz w:val="19"/>
-          <w:szCs w:val="19"/>
-        </w:rPr>
-        <w:t xml:space="preserve">Built an evidence-based content operation producing 16 researched content series (148 designed assets) and 7 long-form video scripts on coffee science, sourced from peer-reviewed literature rather than secondary media</w:t>
-      </w:r>
-    </w:p>
-    <w:p>
-      <w:pPr>
-        <w:pStyle w:val="ListParagraph"/>
-        <w:numPr>
-          <w:ilvl w:val="0"/>
-          <w:numId w:val="1"/>
-        </w:numPr>
-        <w:spacing w:after="50"/>
-      </w:pPr>
-      <w:r>
-        <w:rPr>
-          <w:rFonts w:ascii="Calibri" w:cs="Calibri" w:eastAsia="Calibri" w:hAnsi="Calibri"/>
-          <w:color w:val="2B2B2B"/>
-          <w:sz w:val="19"/>
-          <w:szCs w:val="19"/>
-        </w:rPr>
-        <w:t xml:space="preserve">Designed a three-tier evidence standard applied to every published claim — direct peer review, practitioner consensus, or manufacturer claim — making source strength visible to the audience rather than implied</w:t>
-      </w:r>
-    </w:p>
-    <w:p>
-      <w:pPr>
-        <w:pStyle w:val="ListParagraph"/>
-        <w:numPr>
-          <w:ilvl w:val="0"/>
-          <w:numId w:val="1"/>
-        </w:numPr>
-        <w:spacing w:after="50"/>
-      </w:pPr>
-      <w:r>
-        <w:rPr>
-          <w:rFonts w:ascii="Calibri" w:cs="Calibri" w:eastAsia="Calibri" w:hAnsi="Calibri"/>
-          <w:color w:val="2B2B2B"/>
-          <w:sz w:val="19"/>
-          <w:szCs w:val="19"/>
-        </w:rPr>
-        <w:t xml:space="preserve">Created a proprietary four-part script framework (Hook, Empathy, Content, Action) with the hook resolved before the eight-second mark, now used across all long-form and short-form output</w:t>
-      </w:r>
-    </w:p>
-    <w:p>
-      <w:pPr>
-        <w:pStyle w:val="ListParagraph"/>
-        <w:numPr>
-          <w:ilvl w:val="0"/>
-          <w:numId w:val="1"/>
-        </w:numPr>
-        <w:spacing w:after="50"/>
-      </w:pPr>
-      <w:r>
-        <w:rPr>
-          <w:rFonts w:ascii="Calibri" w:cs="Calibri" w:eastAsia="Calibri" w:hAnsi="Calibri"/>
-          <w:color w:val="2B2B2B"/>
-          <w:sz w:val="19"/>
-          <w:szCs w:val="19"/>
-        </w:rPr>
-        <w:t xml:space="preserve">Run funnel-mapped weekly programming at 3 top-of-funnel, 3 mid-funnel and 1 bottom-of-funnel pieces per week, reviewed weekly against a tracked performance dashboard</w:t>
-      </w:r>
-    </w:p>
-    <w:p>
-      <w:pPr>
-        <w:pStyle w:val="ListParagraph"/>
-        <w:numPr>
-          <w:ilvl w:val="0"/>
-          <w:numId w:val="1"/>
-        </w:numPr>
-        <w:spacing w:after="50"/>
-      </w:pPr>
-      <w:r>
-        <w:rPr>
-          <w:rFonts w:ascii="Calibri" w:cs="Calibri" w:eastAsia="Calibri" w:hAnsi="Calibri"/>
-          <w:color w:val="2B2B2B"/>
-          <w:sz w:val="19"/>
-          <w:szCs w:val="19"/>
-        </w:rPr>
-        <w:t xml:space="preserve">Launched the company’s editorial blog, researching and writing the founding 1,950-word article with 24 cited sources, delivered in both editable and CMS-ready formats</w:t>
-      </w:r>
-    </w:p>
-    <w:p>
-      <w:pPr>
-        <w:pStyle w:val="ListParagraph"/>
-        <w:numPr>
-          <w:ilvl w:val="0"/>
-          <w:numId w:val="1"/>
-        </w:numPr>
-        <w:spacing w:after="50"/>
-      </w:pPr>
-      <w:r>
-        <w:rPr>
-          <w:rFonts w:ascii="Calibri" w:cs="Calibri" w:eastAsia="Calibri" w:hAnsi="Calibri"/>
-          <w:color w:val="2B2B2B"/>
-          <w:sz w:val="19"/>
-          <w:szCs w:val="19"/>
-        </w:rPr>
-        <w:t xml:space="preserve">Developed an in-house editorial design system with a bilingual subtitle layer for international reach and dual-format deliverables for downstream photo compositing</w:t>
+        <w:t xml:space="preserve">Founded and run a specialty coffee company. Own brand direction, marketing and the full content operation.</w:t>
+      </w:r>
+    </w:p>
+    <w:p>
+      <w:pPr>
+        <w:pStyle w:val="ListParagraph"/>
+        <w:numPr>
+          <w:ilvl w:val="0"/>
+          <w:numId w:val="1"/>
+        </w:numPr>
+        <w:spacing w:after="50"/>
+      </w:pPr>
+      <w:r>
+        <w:rPr>
+          <w:rFonts w:ascii="Calibri" w:cs="Calibri" w:eastAsia="Calibri" w:hAnsi="Calibri"/>
+          <w:color w:val="2B2B2B"/>
+          <w:sz w:val="19"/>
+          <w:szCs w:val="19"/>
+        </w:rPr>
+        <w:t xml:space="preserve">Established the company and defined its brand positioning: an evidence-led specialty coffee brand that publishes its own sourcing and brewing research, competing on credibility rather than lifestyle marketing</w:t>
+      </w:r>
+    </w:p>
+    <w:p>
+      <w:pPr>
+        <w:pStyle w:val="ListParagraph"/>
+        <w:numPr>
+          <w:ilvl w:val="0"/>
+          <w:numId w:val="1"/>
+        </w:numPr>
+        <w:spacing w:after="50"/>
+      </w:pPr>
+      <w:r>
+        <w:rPr>
+          <w:rFonts w:ascii="Calibri" w:cs="Calibri" w:eastAsia="Calibri" w:hAnsi="Calibri"/>
+          <w:color w:val="2B2B2B"/>
+          <w:sz w:val="19"/>
+          <w:szCs w:val="19"/>
+        </w:rPr>
+        <w:t xml:space="preserve">Own marketing end to end — brand positioning, channel strategy, campaign planning and performance review across Instagram, TikTok and YouTube</w:t>
+      </w:r>
+    </w:p>
+    <w:p>
+      <w:pPr>
+        <w:pStyle w:val="ListParagraph"/>
+        <w:numPr>
+          <w:ilvl w:val="0"/>
+          <w:numId w:val="1"/>
+        </w:numPr>
+        <w:spacing w:after="50"/>
+      </w:pPr>
+      <w:r>
+        <w:rPr>
+          <w:rFonts w:ascii="Calibri" w:cs="Calibri" w:eastAsia="Calibri" w:hAnsi="Calibri"/>
+          <w:color w:val="2B2B2B"/>
+          <w:sz w:val="19"/>
+          <w:szCs w:val="19"/>
+        </w:rPr>
+        <w:t xml:space="preserve">Run funnel-mapped weekly programming at 3 top-of-funnel, 3 mid-funnel and 1 bottom-of-funnel pieces per week on a fixed publishing slot, reviewed weekly against a tracked performance dashboard</w:t>
+      </w:r>
+    </w:p>
+    <w:p>
+      <w:pPr>
+        <w:pStyle w:val="ListParagraph"/>
+        <w:numPr>
+          <w:ilvl w:val="0"/>
+          <w:numId w:val="1"/>
+        </w:numPr>
+        <w:spacing w:after="50"/>
+      </w:pPr>
+      <w:r>
+        <w:rPr>
+          <w:rFonts w:ascii="Calibri" w:cs="Calibri" w:eastAsia="Calibri" w:hAnsi="Calibri"/>
+          <w:color w:val="2B2B2B"/>
+          <w:sz w:val="19"/>
+          <w:szCs w:val="19"/>
+        </w:rPr>
+        <w:t xml:space="preserve">Built the content operation from zero: 16 researched series (148 designed assets) and 7 long-form video scripts on coffee science, sourced from peer-reviewed literature rather than secondary media</w:t>
+      </w:r>
+    </w:p>
+    <w:p>
+      <w:pPr>
+        <w:pStyle w:val="ListParagraph"/>
+        <w:numPr>
+          <w:ilvl w:val="0"/>
+          <w:numId w:val="1"/>
+        </w:numPr>
+        <w:spacing w:after="50"/>
+      </w:pPr>
+      <w:r>
+        <w:rPr>
+          <w:rFonts w:ascii="Calibri" w:cs="Calibri" w:eastAsia="Calibri" w:hAnsi="Calibri"/>
+          <w:color w:val="2B2B2B"/>
+          <w:sz w:val="19"/>
+          <w:szCs w:val="19"/>
+        </w:rPr>
+        <w:t xml:space="preserve">Set a three-tier evidence standard applied to every published claim — direct peer review, practitioner consensus, or manufacturer claim — now the brand’s core point of difference</w:t>
+      </w:r>
+    </w:p>
+    <w:p>
+      <w:pPr>
+        <w:pStyle w:val="ListParagraph"/>
+        <w:numPr>
+          <w:ilvl w:val="0"/>
+          <w:numId w:val="1"/>
+        </w:numPr>
+        <w:spacing w:after="50"/>
+      </w:pPr>
+      <w:r>
+        <w:rPr>
+          <w:rFonts w:ascii="Calibri" w:cs="Calibri" w:eastAsia="Calibri" w:hAnsi="Calibri"/>
+          <w:color w:val="2B2B2B"/>
+          <w:sz w:val="19"/>
+          <w:szCs w:val="19"/>
+        </w:rPr>
+        <w:t xml:space="preserve">Created a proprietary four-part script framework (Hook, Empathy, Content, Action) with the hook resolved before the eight-second mark, used across all long-form and short-form output</w:t>
+      </w:r>
+    </w:p>
+    <w:p>
+      <w:pPr>
+        <w:pStyle w:val="ListParagraph"/>
+        <w:numPr>
+          <w:ilvl w:val="0"/>
+          <w:numId w:val="1"/>
+        </w:numPr>
+        <w:spacing w:after="50"/>
+      </w:pPr>
+      <w:r>
+        <w:rPr>
+          <w:rFonts w:ascii="Calibri" w:cs="Calibri" w:eastAsia="Calibri" w:hAnsi="Calibri"/>
+          <w:color w:val="2B2B2B"/>
+          <w:sz w:val="19"/>
+          <w:szCs w:val="19"/>
+        </w:rPr>
+        <w:t xml:space="preserve">Launched the company’s editorial blog as an owned marketing channel, researching and writing the founding 1,950-word article with 24 cited sources</w:t>
+      </w:r>
+    </w:p>
+    <w:p>
+      <w:pPr>
+        <w:pStyle w:val="ListParagraph"/>
+        <w:numPr>
+          <w:ilvl w:val="0"/>
+          <w:numId w:val="1"/>
+        </w:numPr>
+        <w:spacing w:after="50"/>
+      </w:pPr>
+      <w:r>
+        <w:rPr>
+          <w:rFonts w:ascii="Calibri" w:cs="Calibri" w:eastAsia="Calibri" w:hAnsi="Calibri"/>
+          <w:color w:val="2B2B2B"/>
+          <w:sz w:val="19"/>
+          <w:szCs w:val="19"/>
+        </w:rPr>
+        <w:t xml:space="preserve">Built an in-house editorial design system with a bilingual subtitle layer to extend reach to international audiences, and direct an external video editor through annotated scripts with embedded graphics and sourced image briefs</w:t>
+      </w:r>
+    </w:p>
+    <w:p>
+      <w:pPr>
+        <w:pStyle w:val="ListParagraph"/>
+        <w:numPr>
+          <w:ilvl w:val="0"/>
+          <w:numId w:val="1"/>
+        </w:numPr>
+        <w:spacing w:after="50"/>
+      </w:pPr>
+      <w:r>
+        <w:rPr>
+          <w:rFonts w:ascii="Calibri" w:cs="Calibri" w:eastAsia="Calibri" w:hAnsi="Calibri"/>
+          <w:color w:val="2B2B2B"/>
+          <w:sz w:val="19"/>
+          <w:szCs w:val="19"/>
+        </w:rPr>
+        <w:t xml:space="preserve">Programme content around in-store events and guest barista takeovers</w:t>
       </w:r>
     </w:p>
     <w:p>
@@ -838,7 +895,7 @@
           <w:sz w:val="19"/>
           <w:szCs w:val="19"/>
         </w:rPr>
-        <w:t xml:space="preserve">brand strategy, SEO and keyword research, on-page optimisation, funnel-based content programming, cross-platform performance analysis</w:t>
+        <w:t xml:space="preserve">brand positioning, channel strategy, campaign planning, funnel-based content programming, SEO and keyword research, on-page optimisation, cross-platform performance analysis</w:t>
       </w:r>
     </w:p>
     <w:p>

</xml_diff>

<commit_message>
Perluas bullet posisi Full-time Trader
Tambah analisis teknikal multi-timeframe, analisis makro dan kebijakan
bank sentral, perencanaan posisi, manajemen risiko, backtesting, dan
jurnal perdagangan.

Co-Authored-By: Claude Opus 5 <noreply@anthropic.com>
Claude-Session: https://claude.ai/code/session_01DWyspajaqx8W3wFxgo15X2
</commit_message>
<xml_diff>
--- a/cv/Resume - Dustin Wijaya (EN).docx
+++ b/cv/Resume - Dustin Wijaya (EN).docx
@@ -54,7 +54,7 @@
         </w:rPr>
         <w:t xml:space="preserve">   ·   [phone]   ·   West Jakarta, Indonesia   ·   </w:t>
       </w:r>
-      <w:hyperlink w:history="1" r:id="rIdfbtxxebvkzbcujioofp8l">
+      <w:hyperlink w:history="1" r:id="rIdcpsrupubgnvh4nxlk0vqw">
         <w:r>
           <w:rPr>
             <w:rFonts w:ascii="Calibri" w:cs="Calibri" w:eastAsia="Calibri" w:hAnsi="Calibri"/>
@@ -506,6 +506,120 @@
     </w:p>
     <w:p>
       <w:pPr>
+        <w:pStyle w:val="ListParagraph"/>
+        <w:numPr>
+          <w:ilvl w:val="0"/>
+          <w:numId w:val="1"/>
+        </w:numPr>
+        <w:spacing w:after="50"/>
+      </w:pPr>
+      <w:r>
+        <w:rPr>
+          <w:rFonts w:ascii="Calibri" w:cs="Calibri" w:eastAsia="Calibri" w:hAnsi="Calibri"/>
+          <w:color w:val="2B2B2B"/>
+          <w:sz w:val="19"/>
+          <w:szCs w:val="19"/>
+        </w:rPr>
+        <w:t xml:space="preserve">Apply technical analysis across multiple timeframes — price action, chart patterns, support and resistance levels, trend and momentum indicators — to time entries and exits</w:t>
+      </w:r>
+    </w:p>
+    <w:p>
+      <w:pPr>
+        <w:pStyle w:val="ListParagraph"/>
+        <w:numPr>
+          <w:ilvl w:val="0"/>
+          <w:numId w:val="1"/>
+        </w:numPr>
+        <w:spacing w:after="50"/>
+      </w:pPr>
+      <w:r>
+        <w:rPr>
+          <w:rFonts w:ascii="Calibri" w:cs="Calibri" w:eastAsia="Calibri" w:hAnsi="Calibri"/>
+          <w:color w:val="2B2B2B"/>
+          <w:sz w:val="19"/>
+          <w:szCs w:val="19"/>
+        </w:rPr>
+        <w:t xml:space="preserve">Track macroeconomic releases, central bank policy and commodity supply and demand data to set directional bias and anticipate volatility around scheduled events</w:t>
+      </w:r>
+    </w:p>
+    <w:p>
+      <w:pPr>
+        <w:pStyle w:val="ListParagraph"/>
+        <w:numPr>
+          <w:ilvl w:val="0"/>
+          <w:numId w:val="1"/>
+        </w:numPr>
+        <w:spacing w:after="50"/>
+      </w:pPr>
+      <w:r>
+        <w:rPr>
+          <w:rFonts w:ascii="Calibri" w:cs="Calibri" w:eastAsia="Calibri" w:hAnsi="Calibri"/>
+          <w:color w:val="2B2B2B"/>
+          <w:sz w:val="19"/>
+          <w:szCs w:val="19"/>
+        </w:rPr>
+        <w:t xml:space="preserve">Define a written plan for each position covering entry criteria, invalidation level, profit target and position size against a fixed risk-per-trade limit</w:t>
+      </w:r>
+    </w:p>
+    <w:p>
+      <w:pPr>
+        <w:pStyle w:val="ListParagraph"/>
+        <w:numPr>
+          <w:ilvl w:val="0"/>
+          <w:numId w:val="1"/>
+        </w:numPr>
+        <w:spacing w:after="50"/>
+      </w:pPr>
+      <w:r>
+        <w:rPr>
+          <w:rFonts w:ascii="Calibri" w:cs="Calibri" w:eastAsia="Calibri" w:hAnsi="Calibri"/>
+          <w:color w:val="2B2B2B"/>
+          <w:sz w:val="19"/>
+          <w:szCs w:val="19"/>
+        </w:rPr>
+        <w:t xml:space="preserve">Manage risk through stop-loss discipline, exposure limits and drawdown control across correlated positions</w:t>
+      </w:r>
+    </w:p>
+    <w:p>
+      <w:pPr>
+        <w:pStyle w:val="ListParagraph"/>
+        <w:numPr>
+          <w:ilvl w:val="0"/>
+          <w:numId w:val="1"/>
+        </w:numPr>
+        <w:spacing w:after="50"/>
+      </w:pPr>
+      <w:r>
+        <w:rPr>
+          <w:rFonts w:ascii="Calibri" w:cs="Calibri" w:eastAsia="Calibri" w:hAnsi="Calibri"/>
+          <w:color w:val="2B2B2B"/>
+          <w:sz w:val="19"/>
+          <w:szCs w:val="19"/>
+        </w:rPr>
+        <w:t xml:space="preserve">Backtest and forward-test setups before committing capital, retiring strategies that fail to hold up out of sample</w:t>
+      </w:r>
+    </w:p>
+    <w:p>
+      <w:pPr>
+        <w:pStyle w:val="ListParagraph"/>
+        <w:numPr>
+          <w:ilvl w:val="0"/>
+          <w:numId w:val="1"/>
+        </w:numPr>
+        <w:spacing w:after="50"/>
+      </w:pPr>
+      <w:r>
+        <w:rPr>
+          <w:rFonts w:ascii="Calibri" w:cs="Calibri" w:eastAsia="Calibri" w:hAnsi="Calibri"/>
+          <w:color w:val="2B2B2B"/>
+          <w:sz w:val="19"/>
+          <w:szCs w:val="19"/>
+        </w:rPr>
+        <w:t xml:space="preserve">Maintain a trade journal and review performance on a recurring cycle, using the results to refine setups and correct recurring execution errors</w:t>
+      </w:r>
+    </w:p>
+    <w:p>
+      <w:pPr>
         <w:spacing w:after="55"/>
       </w:pPr>
       <w:r>
@@ -517,7 +631,7 @@
           <w:sz w:val="18"/>
           <w:szCs w:val="18"/>
         </w:rPr>
-        <w:t xml:space="preserve">Add 1–2 bullets here on risk management approach or the scale you trade at, if you are comfortable disclosing it.</w:t>
+        <w:t xml:space="preserve">Optional: add your own figures here — years profitable, average risk-reward, markets you specialise in — only if you are comfortable disclosing them.</w:t>
       </w:r>
     </w:p>
     <w:p>

</xml_diff>

<commit_message>
Lengkapi job desc tiga posisi terakhir di resume
Digital Marketing Specialist, Assistant Vice President, dan Financial
Services Consultant masing-masing dapat enam bullet sesuai perannya.

Co-Authored-By: Claude Opus 5 <noreply@anthropic.com>
Claude-Session: https://claude.ai/code/session_01DWyspajaqx8W3wFxgo15X2
</commit_message>
<xml_diff>
--- a/cv/Resume - Dustin Wijaya (EN).docx
+++ b/cv/Resume - Dustin Wijaya (EN).docx
@@ -54,7 +54,7 @@
         </w:rPr>
         <w:t xml:space="preserve">   ·   [phone]   ·   West Jakarta, Indonesia   ·   </w:t>
       </w:r>
-      <w:hyperlink w:history="1" r:id="rIdcpsrupubgnvh4nxlk0vqw">
+      <w:hyperlink w:history="1" r:id="rId8xxsn1tebvlbkr8rzvpjr">
         <w:r>
           <w:rPr>
             <w:rFonts w:ascii="Calibri" w:cs="Calibri" w:eastAsia="Calibri" w:hAnsi="Calibri"/>
@@ -711,7 +711,83 @@
           <w:sz w:val="19"/>
           <w:szCs w:val="19"/>
         </w:rPr>
-        <w:t xml:space="preserve">Delivered brand strategy and digital marketing media across client channels</w:t>
+        <w:t xml:space="preserve">Developed brand strategy and positioning for clients, translating business goals into channel-level messaging and creative direction</w:t>
+      </w:r>
+    </w:p>
+    <w:p>
+      <w:pPr>
+        <w:pStyle w:val="ListParagraph"/>
+        <w:numPr>
+          <w:ilvl w:val="0"/>
+          <w:numId w:val="1"/>
+        </w:numPr>
+        <w:spacing w:after="50"/>
+      </w:pPr>
+      <w:r>
+        <w:rPr>
+          <w:rFonts w:ascii="Calibri" w:cs="Calibri" w:eastAsia="Calibri" w:hAnsi="Calibri"/>
+          <w:color w:val="2B2B2B"/>
+          <w:sz w:val="19"/>
+          <w:szCs w:val="19"/>
+        </w:rPr>
+        <w:t xml:space="preserve">Planned and produced digital marketing media across client channels — social posts, ad creative and landing page copy</w:t>
+      </w:r>
+    </w:p>
+    <w:p>
+      <w:pPr>
+        <w:pStyle w:val="ListParagraph"/>
+        <w:numPr>
+          <w:ilvl w:val="0"/>
+          <w:numId w:val="1"/>
+        </w:numPr>
+        <w:spacing w:after="50"/>
+      </w:pPr>
+      <w:r>
+        <w:rPr>
+          <w:rFonts w:ascii="Calibri" w:cs="Calibri" w:eastAsia="Calibri" w:hAnsi="Calibri"/>
+          <w:color w:val="2B2B2B"/>
+          <w:sz w:val="19"/>
+          <w:szCs w:val="19"/>
+        </w:rPr>
+        <w:t xml:space="preserve">Managed day-to-day social publishing and community engagement against a consistent content calendar</w:t>
+      </w:r>
+    </w:p>
+    <w:p>
+      <w:pPr>
+        <w:pStyle w:val="ListParagraph"/>
+        <w:numPr>
+          <w:ilvl w:val="0"/>
+          <w:numId w:val="1"/>
+        </w:numPr>
+        <w:spacing w:after="50"/>
+      </w:pPr>
+      <w:r>
+        <w:rPr>
+          <w:rFonts w:ascii="Calibri" w:cs="Calibri" w:eastAsia="Calibri" w:hAnsi="Calibri"/>
+          <w:color w:val="2B2B2B"/>
+          <w:sz w:val="19"/>
+          <w:szCs w:val="19"/>
+        </w:rPr>
+        <w:t xml:space="preserve">Ran competitor and audience research to identify content gaps and positioning opportunities</w:t>
+      </w:r>
+    </w:p>
+    <w:p>
+      <w:pPr>
+        <w:pStyle w:val="ListParagraph"/>
+        <w:numPr>
+          <w:ilvl w:val="0"/>
+          <w:numId w:val="1"/>
+        </w:numPr>
+        <w:spacing w:after="50"/>
+      </w:pPr>
+      <w:r>
+        <w:rPr>
+          <w:rFonts w:ascii="Calibri" w:cs="Calibri" w:eastAsia="Calibri" w:hAnsi="Calibri"/>
+          <w:color w:val="2B2B2B"/>
+          <w:sz w:val="19"/>
+          <w:szCs w:val="19"/>
+        </w:rPr>
+        <w:t xml:space="preserve">Set up campaign tracking and reported on traffic, engagement and conversion performance to steer the next cycle</w:t>
       </w:r>
     </w:p>
     <w:p>
@@ -791,7 +867,83 @@
           <w:sz w:val="19"/>
           <w:szCs w:val="19"/>
         </w:rPr>
-        <w:t xml:space="preserve">Handled bookkeeping and supported financial reporting</w:t>
+        <w:t xml:space="preserve">Prepared business and financial reports, briefing materials and presentation decks for management review</w:t>
+      </w:r>
+    </w:p>
+    <w:p>
+      <w:pPr>
+        <w:pStyle w:val="ListParagraph"/>
+        <w:numPr>
+          <w:ilvl w:val="0"/>
+          <w:numId w:val="1"/>
+        </w:numPr>
+        <w:spacing w:after="50"/>
+      </w:pPr>
+      <w:r>
+        <w:rPr>
+          <w:rFonts w:ascii="Calibri" w:cs="Calibri" w:eastAsia="Calibri" w:hAnsi="Calibri"/>
+          <w:color w:val="2B2B2B"/>
+          <w:sz w:val="19"/>
+          <w:szCs w:val="19"/>
+        </w:rPr>
+        <w:t xml:space="preserve">Handled bookkeeping — recorded transactions, reconciled accounts and supported monthly and year-end financial reporting</w:t>
+      </w:r>
+    </w:p>
+    <w:p>
+      <w:pPr>
+        <w:pStyle w:val="ListParagraph"/>
+        <w:numPr>
+          <w:ilvl w:val="0"/>
+          <w:numId w:val="1"/>
+        </w:numPr>
+        <w:spacing w:after="50"/>
+      </w:pPr>
+      <w:r>
+        <w:rPr>
+          <w:rFonts w:ascii="Calibri" w:cs="Calibri" w:eastAsia="Calibri" w:hAnsi="Calibri"/>
+          <w:color w:val="2B2B2B"/>
+          <w:sz w:val="19"/>
+          <w:szCs w:val="19"/>
+        </w:rPr>
+        <w:t xml:space="preserve">Coordinated across departments to track progress against targets and escalated blockers to the Vice President</w:t>
+      </w:r>
+    </w:p>
+    <w:p>
+      <w:pPr>
+        <w:pStyle w:val="ListParagraph"/>
+        <w:numPr>
+          <w:ilvl w:val="0"/>
+          <w:numId w:val="1"/>
+        </w:numPr>
+        <w:spacing w:after="50"/>
+      </w:pPr>
+      <w:r>
+        <w:rPr>
+          <w:rFonts w:ascii="Calibri" w:cs="Calibri" w:eastAsia="Calibri" w:hAnsi="Calibri"/>
+          <w:color w:val="2B2B2B"/>
+          <w:sz w:val="19"/>
+          <w:szCs w:val="19"/>
+        </w:rPr>
+        <w:t xml:space="preserve">Supported budgeting and cost monitoring, flagging variances against plan</w:t>
+      </w:r>
+    </w:p>
+    <w:p>
+      <w:pPr>
+        <w:pStyle w:val="ListParagraph"/>
+        <w:numPr>
+          <w:ilvl w:val="0"/>
+          <w:numId w:val="1"/>
+        </w:numPr>
+        <w:spacing w:after="50"/>
+      </w:pPr>
+      <w:r>
+        <w:rPr>
+          <w:rFonts w:ascii="Calibri" w:cs="Calibri" w:eastAsia="Calibri" w:hAnsi="Calibri"/>
+          <w:color w:val="2B2B2B"/>
+          <w:sz w:val="19"/>
+          <w:szCs w:val="19"/>
+        </w:rPr>
+        <w:t xml:space="preserve">Maintained company documentation and administrative records, keeping internal reporting and filings current</w:t>
       </w:r>
     </w:p>
     <w:p>
@@ -871,7 +1023,83 @@
           <w:sz w:val="19"/>
           <w:szCs w:val="19"/>
         </w:rPr>
-        <w:t xml:space="preserve">Advised clients on financial services and investment products</w:t>
+        <w:t xml:space="preserve">Advised clients on financial products and investment options, assessing risk profile and objectives before recommending a strategy</w:t>
+      </w:r>
+    </w:p>
+    <w:p>
+      <w:pPr>
+        <w:pStyle w:val="ListParagraph"/>
+        <w:numPr>
+          <w:ilvl w:val="0"/>
+          <w:numId w:val="1"/>
+        </w:numPr>
+        <w:spacing w:after="50"/>
+      </w:pPr>
+      <w:r>
+        <w:rPr>
+          <w:rFonts w:ascii="Calibri" w:cs="Calibri" w:eastAsia="Calibri" w:hAnsi="Calibri"/>
+          <w:color w:val="2B2B2B"/>
+          <w:sz w:val="19"/>
+          <w:szCs w:val="19"/>
+        </w:rPr>
+        <w:t xml:space="preserve">Explained product mechanics, cost structures and risk exposure so clients could make informed decisions</w:t>
+      </w:r>
+    </w:p>
+    <w:p>
+      <w:pPr>
+        <w:pStyle w:val="ListParagraph"/>
+        <w:numPr>
+          <w:ilvl w:val="0"/>
+          <w:numId w:val="1"/>
+        </w:numPr>
+        <w:spacing w:after="50"/>
+      </w:pPr>
+      <w:r>
+        <w:rPr>
+          <w:rFonts w:ascii="Calibri" w:cs="Calibri" w:eastAsia="Calibri" w:hAnsi="Calibri"/>
+          <w:color w:val="2B2B2B"/>
+          <w:sz w:val="19"/>
+          <w:szCs w:val="19"/>
+        </w:rPr>
+        <w:t xml:space="preserve">Delivered regular market updates and portfolio reviews, adjusting recommendations as conditions changed</w:t>
+      </w:r>
+    </w:p>
+    <w:p>
+      <w:pPr>
+        <w:pStyle w:val="ListParagraph"/>
+        <w:numPr>
+          <w:ilvl w:val="0"/>
+          <w:numId w:val="1"/>
+        </w:numPr>
+        <w:spacing w:after="50"/>
+      </w:pPr>
+      <w:r>
+        <w:rPr>
+          <w:rFonts w:ascii="Calibri" w:cs="Calibri" w:eastAsia="Calibri" w:hAnsi="Calibri"/>
+          <w:color w:val="2B2B2B"/>
+          <w:sz w:val="19"/>
+          <w:szCs w:val="19"/>
+        </w:rPr>
+        <w:t xml:space="preserve">Prospected and onboarded new clients, guiding them through account opening, documentation and compliance requirements</w:t>
+      </w:r>
+    </w:p>
+    <w:p>
+      <w:pPr>
+        <w:pStyle w:val="ListParagraph"/>
+        <w:numPr>
+          <w:ilvl w:val="0"/>
+          <w:numId w:val="1"/>
+        </w:numPr>
+        <w:spacing w:after="50"/>
+      </w:pPr>
+      <w:r>
+        <w:rPr>
+          <w:rFonts w:ascii="Calibri" w:cs="Calibri" w:eastAsia="Calibri" w:hAnsi="Calibri"/>
+          <w:color w:val="2B2B2B"/>
+          <w:sz w:val="19"/>
+          <w:szCs w:val="19"/>
+        </w:rPr>
+        <w:t xml:space="preserve">Worked within regulatory and internal compliance requirements across all client-facing activity</w:t>
       </w:r>
     </w:p>
     <w:p>

</xml_diff>

<commit_message>
Ganti jabatan di resume jadi Creative Director
- Hapus semua penyebutan Founder, Founded, Creative Producer, dan
  Established the company
- Sesuaikan subjudul, summary, dan blok Terroir ke arah kreatif dan
  marketing sesuai posisi yang dilamar
- Ikuti editan Dustin: kontak baru, GPA, dan penghapusan posisi Trader
  serta Financial Services Consultant
- Tambah kelompok skill Creative direction, ganti Finance jadi Business

Co-Authored-By: Claude Opus 5 <noreply@anthropic.com>
Claude-Session: https://claude.ai/code/session_01DWyspajaqx8W3wFxgo15X2
</commit_message>
<xml_diff>
--- a/cv/Resume - Dustin Wijaya (EN).docx
+++ b/cv/Resume - Dustin Wijaya (EN).docx
@@ -29,7 +29,7 @@
           <w:sz w:val="20"/>
           <w:szCs w:val="20"/>
         </w:rPr>
-        <w:t xml:space="preserve">Founder &amp; Marketing Lead</w:t>
+        <w:t xml:space="preserve">Creative Director &amp; Marketing Lead</w:t>
       </w:r>
     </w:p>
     <w:p>
@@ -43,7 +43,7 @@
           <w:sz w:val="17"/>
           <w:szCs w:val="17"/>
         </w:rPr>
-        <w:t xml:space="preserve">ericangelo1503@gmail.com</w:t>
+        <w:t xml:space="preserve">Dustinwijaya04@gmail.com</w:t>
       </w:r>
       <w:r>
         <w:rPr>
@@ -52,9 +52,9 @@
           <w:sz w:val="17"/>
           <w:szCs w:val="17"/>
         </w:rPr>
-        <w:t xml:space="preserve">   ·   [phone]   ·   West Jakarta, Indonesia   ·   </w:t>
-      </w:r>
-      <w:hyperlink w:history="1" r:id="rId8xxsn1tebvlbkr8rzvpjr">
+        <w:t xml:space="preserve">   ·   +62 813-1408-5961   ·   Indonesia   ·   </w:t>
+      </w:r>
+      <w:hyperlink w:history="1" r:id="rIdbhjgoiy1ecdm71xohn-4v">
         <w:r>
           <w:rPr>
             <w:rFonts w:ascii="Calibri" w:cs="Calibri" w:eastAsia="Calibri" w:hAnsi="Calibri"/>
@@ -96,7 +96,7 @@
           <w:sz w:val="19"/>
           <w:szCs w:val="19"/>
         </w:rPr>
-        <w:t xml:space="preserve">Founder of a specialty coffee company, running marketing end to end alongside an analytical background in financial markets. Own brand positioning, channel strategy and the full content pipeline from research question to published asset. Build systems rather than one-off output: a documented evidence standard applied to every published claim, a repeatable script framework, and funnel-mapped programming reviewed weekly against tracked performance. Eight years of market analysis underpins a working habit of going to primary sources and testing a claim before publishing it.</w:t>
+        <w:t xml:space="preserve">Creative Director at a specialty coffee company, running marketing end to end. Own brand positioning, channel strategy and the full content pipeline from research question to published asset — concepting, scripting, editorial design and direction of external production. Build systems rather than one-off output: a documented evidence standard applied to every published claim, a repeatable script framework, and funnel-mapped programming reviewed weekly against a tracked performance dashboard.</w:t>
       </w:r>
     </w:p>
     <w:p>
@@ -133,7 +133,7 @@
           <w:sz w:val="20"/>
           <w:szCs w:val="20"/>
         </w:rPr>
-        <w:t xml:space="preserve">Founder</w:t>
+        <w:t xml:space="preserve">Creative Director</w:t>
       </w:r>
       <w:r>
         <w:rPr>
@@ -142,7 +142,7 @@
           <w:sz w:val="18"/>
           <w:szCs w:val="18"/>
         </w:rPr>
-        <w:t xml:space="preserve">	[Month Year] – Present</w:t>
+        <w:t xml:space="preserve">	December 2024 – Present</w:t>
       </w:r>
     </w:p>
     <w:p>
@@ -156,7 +156,7 @@
           <w:sz w:val="18"/>
           <w:szCs w:val="18"/>
         </w:rPr>
-        <w:t xml:space="preserve">PT Terroir Origin Indonesia (Terroir IDN) · Gading Serpong, Indonesia · On-site</w:t>
+        <w:t xml:space="preserve">PT Terroir Origin Indonesia (Terroir IDN) · Indonesia · On-site</w:t>
       </w:r>
     </w:p>
     <w:p>
@@ -170,26 +170,26 @@
           <w:sz w:val="19"/>
           <w:szCs w:val="19"/>
         </w:rPr>
-        <w:t xml:space="preserve">Founded and run a specialty coffee company. Own brand direction, marketing and the full content operation.</w:t>
-      </w:r>
-    </w:p>
-    <w:p>
-      <w:pPr>
-        <w:pStyle w:val="ListParagraph"/>
-        <w:numPr>
-          <w:ilvl w:val="0"/>
-          <w:numId w:val="1"/>
-        </w:numPr>
-        <w:spacing w:after="50"/>
-      </w:pPr>
-      <w:r>
-        <w:rPr>
-          <w:rFonts w:ascii="Calibri" w:cs="Calibri" w:eastAsia="Calibri" w:hAnsi="Calibri"/>
-          <w:color w:val="2B2B2B"/>
-          <w:sz w:val="19"/>
-          <w:szCs w:val="19"/>
-        </w:rPr>
-        <w:t xml:space="preserve">Established the company and defined its brand positioning: an evidence-led specialty coffee brand that publishes its own sourcing and brewing research, competing on credibility rather than lifestyle marketing</w:t>
+        <w:t xml:space="preserve">Lead creative direction, marketing and the full content operation for a specialty coffee company.</w:t>
+      </w:r>
+    </w:p>
+    <w:p>
+      <w:pPr>
+        <w:pStyle w:val="ListParagraph"/>
+        <w:numPr>
+          <w:ilvl w:val="0"/>
+          <w:numId w:val="1"/>
+        </w:numPr>
+        <w:spacing w:after="50"/>
+      </w:pPr>
+      <w:r>
+        <w:rPr>
+          <w:rFonts w:ascii="Calibri" w:cs="Calibri" w:eastAsia="Calibri" w:hAnsi="Calibri"/>
+          <w:color w:val="2B2B2B"/>
+          <w:sz w:val="19"/>
+          <w:szCs w:val="19"/>
+        </w:rPr>
+        <w:t xml:space="preserve">Defined the brand positioning: an evidence-led specialty coffee brand that publishes its own sourcing and brewing research, competing on credibility rather than lifestyle marketing</w:t>
       </w:r>
     </w:p>
     <w:p>
@@ -303,26 +303,45 @@
           <w:sz w:val="19"/>
           <w:szCs w:val="19"/>
         </w:rPr>
+        <w:t xml:space="preserve">Direct an external video editor through annotated scripts with embedded graphics and sourced image briefs, reviewing cuts against the brand’s visual and editorial standard</w:t>
+      </w:r>
+    </w:p>
+    <w:p>
+      <w:pPr>
+        <w:pStyle w:val="ListParagraph"/>
+        <w:numPr>
+          <w:ilvl w:val="0"/>
+          <w:numId w:val="1"/>
+        </w:numPr>
+        <w:spacing w:after="50"/>
+      </w:pPr>
+      <w:r>
+        <w:rPr>
+          <w:rFonts w:ascii="Calibri" w:cs="Calibri" w:eastAsia="Calibri" w:hAnsi="Calibri"/>
+          <w:color w:val="2B2B2B"/>
+          <w:sz w:val="19"/>
+          <w:szCs w:val="19"/>
+        </w:rPr>
+        <w:t xml:space="preserve">Built an in-house editorial design system with a bilingual subtitle layer to extend reach to international audiences</w:t>
+      </w:r>
+    </w:p>
+    <w:p>
+      <w:pPr>
+        <w:pStyle w:val="ListParagraph"/>
+        <w:numPr>
+          <w:ilvl w:val="0"/>
+          <w:numId w:val="1"/>
+        </w:numPr>
+        <w:spacing w:after="50"/>
+      </w:pPr>
+      <w:r>
+        <w:rPr>
+          <w:rFonts w:ascii="Calibri" w:cs="Calibri" w:eastAsia="Calibri" w:hAnsi="Calibri"/>
+          <w:color w:val="2B2B2B"/>
+          <w:sz w:val="19"/>
+          <w:szCs w:val="19"/>
+        </w:rPr>
         <w:t xml:space="preserve">Launched the company’s editorial blog as an owned marketing channel, researching and writing the founding 1,950-word article with 24 cited sources</w:t>
-      </w:r>
-    </w:p>
-    <w:p>
-      <w:pPr>
-        <w:pStyle w:val="ListParagraph"/>
-        <w:numPr>
-          <w:ilvl w:val="0"/>
-          <w:numId w:val="1"/>
-        </w:numPr>
-        <w:spacing w:after="50"/>
-      </w:pPr>
-      <w:r>
-        <w:rPr>
-          <w:rFonts w:ascii="Calibri" w:cs="Calibri" w:eastAsia="Calibri" w:hAnsi="Calibri"/>
-          <w:color w:val="2B2B2B"/>
-          <w:sz w:val="19"/>
-          <w:szCs w:val="19"/>
-        </w:rPr>
-        <w:t xml:space="preserve">Built an in-house editorial design system with a bilingual subtitle layer to extend reach to international audiences, and direct an external video editor through annotated scripts with embedded graphics and sourced image briefs</w:t>
       </w:r>
     </w:p>
     <w:p>
@@ -459,7 +478,7 @@
           <w:sz w:val="20"/>
           <w:szCs w:val="20"/>
         </w:rPr>
-        <w:t xml:space="preserve">Full-time Trader</w:t>
+        <w:t xml:space="preserve">Digital Marketing Specialist</w:t>
       </w:r>
       <w:r>
         <w:rPr>
@@ -468,7 +487,7 @@
           <w:sz w:val="18"/>
           <w:szCs w:val="18"/>
         </w:rPr>
-        <w:t xml:space="preserve">	Feb 2018 – Present</w:t>
+        <w:t xml:space="preserve">	Jan 2023 – Sep 2023</w:t>
       </w:r>
     </w:p>
     <w:p>
@@ -482,156 +501,121 @@
           <w:sz w:val="18"/>
           <w:szCs w:val="18"/>
         </w:rPr>
-        <w:t xml:space="preserve">Self-employed · Remote</w:t>
-      </w:r>
-    </w:p>
-    <w:p>
-      <w:pPr>
-        <w:pStyle w:val="ListParagraph"/>
-        <w:numPr>
-          <w:ilvl w:val="0"/>
-          <w:numId w:val="1"/>
-        </w:numPr>
-        <w:spacing w:after="50"/>
-      </w:pPr>
-      <w:r>
-        <w:rPr>
-          <w:rFonts w:ascii="Calibri" w:cs="Calibri" w:eastAsia="Calibri" w:hAnsi="Calibri"/>
-          <w:color w:val="2B2B2B"/>
-          <w:sz w:val="19"/>
-          <w:szCs w:val="19"/>
-        </w:rPr>
-        <w:t xml:space="preserve">Conduct in-depth analysis of financial markets — equities, commodities, currencies and derivatives — to identify trading opportunities on both fundamental and technical factors</w:t>
-      </w:r>
-    </w:p>
-    <w:p>
-      <w:pPr>
-        <w:pStyle w:val="ListParagraph"/>
-        <w:numPr>
-          <w:ilvl w:val="0"/>
-          <w:numId w:val="1"/>
-        </w:numPr>
-        <w:spacing w:after="50"/>
-      </w:pPr>
-      <w:r>
-        <w:rPr>
-          <w:rFonts w:ascii="Calibri" w:cs="Calibri" w:eastAsia="Calibri" w:hAnsi="Calibri"/>
-          <w:color w:val="2B2B2B"/>
-          <w:sz w:val="19"/>
-          <w:szCs w:val="19"/>
-        </w:rPr>
-        <w:t xml:space="preserve">Apply technical analysis across multiple timeframes — price action, chart patterns, support and resistance levels, trend and momentum indicators — to time entries and exits</w:t>
-      </w:r>
-    </w:p>
-    <w:p>
-      <w:pPr>
-        <w:pStyle w:val="ListParagraph"/>
-        <w:numPr>
-          <w:ilvl w:val="0"/>
-          <w:numId w:val="1"/>
-        </w:numPr>
-        <w:spacing w:after="50"/>
-      </w:pPr>
-      <w:r>
-        <w:rPr>
-          <w:rFonts w:ascii="Calibri" w:cs="Calibri" w:eastAsia="Calibri" w:hAnsi="Calibri"/>
-          <w:color w:val="2B2B2B"/>
-          <w:sz w:val="19"/>
-          <w:szCs w:val="19"/>
-        </w:rPr>
-        <w:t xml:space="preserve">Track macroeconomic releases, central bank policy and commodity supply and demand data to set directional bias and anticipate volatility around scheduled events</w:t>
-      </w:r>
-    </w:p>
-    <w:p>
-      <w:pPr>
-        <w:pStyle w:val="ListParagraph"/>
-        <w:numPr>
-          <w:ilvl w:val="0"/>
-          <w:numId w:val="1"/>
-        </w:numPr>
-        <w:spacing w:after="50"/>
-      </w:pPr>
-      <w:r>
-        <w:rPr>
-          <w:rFonts w:ascii="Calibri" w:cs="Calibri" w:eastAsia="Calibri" w:hAnsi="Calibri"/>
-          <w:color w:val="2B2B2B"/>
-          <w:sz w:val="19"/>
-          <w:szCs w:val="19"/>
-        </w:rPr>
-        <w:t xml:space="preserve">Define a written plan for each position covering entry criteria, invalidation level, profit target and position size against a fixed risk-per-trade limit</w:t>
-      </w:r>
-    </w:p>
-    <w:p>
-      <w:pPr>
-        <w:pStyle w:val="ListParagraph"/>
-        <w:numPr>
-          <w:ilvl w:val="0"/>
-          <w:numId w:val="1"/>
-        </w:numPr>
-        <w:spacing w:after="50"/>
-      </w:pPr>
-      <w:r>
-        <w:rPr>
-          <w:rFonts w:ascii="Calibri" w:cs="Calibri" w:eastAsia="Calibri" w:hAnsi="Calibri"/>
-          <w:color w:val="2B2B2B"/>
-          <w:sz w:val="19"/>
-          <w:szCs w:val="19"/>
-        </w:rPr>
-        <w:t xml:space="preserve">Manage risk through stop-loss discipline, exposure limits and drawdown control across correlated positions</w:t>
-      </w:r>
-    </w:p>
-    <w:p>
-      <w:pPr>
-        <w:pStyle w:val="ListParagraph"/>
-        <w:numPr>
-          <w:ilvl w:val="0"/>
-          <w:numId w:val="1"/>
-        </w:numPr>
-        <w:spacing w:after="50"/>
-      </w:pPr>
-      <w:r>
-        <w:rPr>
-          <w:rFonts w:ascii="Calibri" w:cs="Calibri" w:eastAsia="Calibri" w:hAnsi="Calibri"/>
-          <w:color w:val="2B2B2B"/>
-          <w:sz w:val="19"/>
-          <w:szCs w:val="19"/>
-        </w:rPr>
-        <w:t xml:space="preserve">Backtest and forward-test setups before committing capital, retiring strategies that fail to hold up out of sample</w:t>
-      </w:r>
-    </w:p>
-    <w:p>
-      <w:pPr>
-        <w:pStyle w:val="ListParagraph"/>
-        <w:numPr>
-          <w:ilvl w:val="0"/>
-          <w:numId w:val="1"/>
-        </w:numPr>
-        <w:spacing w:after="50"/>
-      </w:pPr>
-      <w:r>
-        <w:rPr>
-          <w:rFonts w:ascii="Calibri" w:cs="Calibri" w:eastAsia="Calibri" w:hAnsi="Calibri"/>
-          <w:color w:val="2B2B2B"/>
-          <w:sz w:val="19"/>
-          <w:szCs w:val="19"/>
-        </w:rPr>
-        <w:t xml:space="preserve">Maintain a trade journal and review performance on a recurring cycle, using the results to refine setups and correct recurring execution errors</w:t>
-      </w:r>
-    </w:p>
-    <w:p>
-      <w:pPr>
-        <w:spacing w:after="55"/>
-      </w:pPr>
-      <w:r>
-        <w:rPr>
-          <w:rFonts w:ascii="Calibri" w:cs="Calibri" w:eastAsia="Calibri" w:hAnsi="Calibri"/>
-          <w:i/>
-          <w:iCs/>
-          <w:color w:val="9A9A9A"/>
-          <w:sz w:val="18"/>
-          <w:szCs w:val="18"/>
-        </w:rPr>
-        <w:t xml:space="preserve">Optional: add your own figures here — years profitable, average risk-reward, markets you specialise in — only if you are comfortable disclosing them.</w:t>
+        <w:t xml:space="preserve">Freelance · Indonesia · On-site</w:t>
+      </w:r>
+    </w:p>
+    <w:p>
+      <w:pPr>
+        <w:pStyle w:val="ListParagraph"/>
+        <w:numPr>
+          <w:ilvl w:val="0"/>
+          <w:numId w:val="1"/>
+        </w:numPr>
+        <w:spacing w:after="50"/>
+      </w:pPr>
+      <w:r>
+        <w:rPr>
+          <w:rFonts w:ascii="Calibri" w:cs="Calibri" w:eastAsia="Calibri" w:hAnsi="Calibri"/>
+          <w:color w:val="2B2B2B"/>
+          <w:sz w:val="19"/>
+          <w:szCs w:val="19"/>
+        </w:rPr>
+        <w:t xml:space="preserve">Conducted keyword research and analysis to identify relevant search terms, optimising website content, meta tags and link structures for improved organic search rankings and visibility</w:t>
+      </w:r>
+    </w:p>
+    <w:p>
+      <w:pPr>
+        <w:pStyle w:val="ListParagraph"/>
+        <w:numPr>
+          <w:ilvl w:val="0"/>
+          <w:numId w:val="1"/>
+        </w:numPr>
+        <w:spacing w:after="50"/>
+      </w:pPr>
+      <w:r>
+        <w:rPr>
+          <w:rFonts w:ascii="Calibri" w:cs="Calibri" w:eastAsia="Calibri" w:hAnsi="Calibri"/>
+          <w:color w:val="2B2B2B"/>
+          <w:sz w:val="19"/>
+          <w:szCs w:val="19"/>
+        </w:rPr>
+        <w:t xml:space="preserve">Developed brand strategy and positioning for clients, translating business goals into channel-level messaging and creative direction</w:t>
+      </w:r>
+    </w:p>
+    <w:p>
+      <w:pPr>
+        <w:pStyle w:val="ListParagraph"/>
+        <w:numPr>
+          <w:ilvl w:val="0"/>
+          <w:numId w:val="1"/>
+        </w:numPr>
+        <w:spacing w:after="50"/>
+      </w:pPr>
+      <w:r>
+        <w:rPr>
+          <w:rFonts w:ascii="Calibri" w:cs="Calibri" w:eastAsia="Calibri" w:hAnsi="Calibri"/>
+          <w:color w:val="2B2B2B"/>
+          <w:sz w:val="19"/>
+          <w:szCs w:val="19"/>
+        </w:rPr>
+        <w:t xml:space="preserve">Planned and produced digital marketing media across client channels — social posts, ad creative and landing page copy</w:t>
+      </w:r>
+    </w:p>
+    <w:p>
+      <w:pPr>
+        <w:pStyle w:val="ListParagraph"/>
+        <w:numPr>
+          <w:ilvl w:val="0"/>
+          <w:numId w:val="1"/>
+        </w:numPr>
+        <w:spacing w:after="50"/>
+      </w:pPr>
+      <w:r>
+        <w:rPr>
+          <w:rFonts w:ascii="Calibri" w:cs="Calibri" w:eastAsia="Calibri" w:hAnsi="Calibri"/>
+          <w:color w:val="2B2B2B"/>
+          <w:sz w:val="19"/>
+          <w:szCs w:val="19"/>
+        </w:rPr>
+        <w:t xml:space="preserve">Managed day-to-day social publishing and community engagement against a consistent content calendar</w:t>
+      </w:r>
+    </w:p>
+    <w:p>
+      <w:pPr>
+        <w:pStyle w:val="ListParagraph"/>
+        <w:numPr>
+          <w:ilvl w:val="0"/>
+          <w:numId w:val="1"/>
+        </w:numPr>
+        <w:spacing w:after="50"/>
+      </w:pPr>
+      <w:r>
+        <w:rPr>
+          <w:rFonts w:ascii="Calibri" w:cs="Calibri" w:eastAsia="Calibri" w:hAnsi="Calibri"/>
+          <w:color w:val="2B2B2B"/>
+          <w:sz w:val="19"/>
+          <w:szCs w:val="19"/>
+        </w:rPr>
+        <w:t xml:space="preserve">Ran competitor and audience research to identify content gaps and positioning opportunities</w:t>
+      </w:r>
+    </w:p>
+    <w:p>
+      <w:pPr>
+        <w:pStyle w:val="ListParagraph"/>
+        <w:numPr>
+          <w:ilvl w:val="0"/>
+          <w:numId w:val="1"/>
+        </w:numPr>
+        <w:spacing w:after="50"/>
+      </w:pPr>
+      <w:r>
+        <w:rPr>
+          <w:rFonts w:ascii="Calibri" w:cs="Calibri" w:eastAsia="Calibri" w:hAnsi="Calibri"/>
+          <w:color w:val="2B2B2B"/>
+          <w:sz w:val="19"/>
+          <w:szCs w:val="19"/>
+        </w:rPr>
+        <w:t xml:space="preserve">Set up campaign tracking and reported on traffic, engagement and conversion performance to steer the next cycle</w:t>
       </w:r>
     </w:p>
     <w:p>
@@ -650,7 +634,7 @@
           <w:sz w:val="20"/>
           <w:szCs w:val="20"/>
         </w:rPr>
-        <w:t xml:space="preserve">Digital Marketing Specialist</w:t>
+        <w:t xml:space="preserve">Assistant Vice President</w:t>
       </w:r>
       <w:r>
         <w:rPr>
@@ -659,7 +643,7 @@
           <w:sz w:val="18"/>
           <w:szCs w:val="18"/>
         </w:rPr>
-        <w:t xml:space="preserve">	Jan 2023 – Sep 2023</w:t>
+        <w:t xml:space="preserve">	Jun 2022 – Jan 2023</w:t>
       </w:r>
     </w:p>
     <w:p>
@@ -673,121 +657,139 @@
           <w:sz w:val="18"/>
           <w:szCs w:val="18"/>
         </w:rPr>
-        <w:t xml:space="preserve">Freelance · Indonesia · On-site</w:t>
-      </w:r>
-    </w:p>
-    <w:p>
-      <w:pPr>
-        <w:pStyle w:val="ListParagraph"/>
-        <w:numPr>
-          <w:ilvl w:val="0"/>
-          <w:numId w:val="1"/>
-        </w:numPr>
-        <w:spacing w:after="50"/>
-      </w:pPr>
-      <w:r>
-        <w:rPr>
-          <w:rFonts w:ascii="Calibri" w:cs="Calibri" w:eastAsia="Calibri" w:hAnsi="Calibri"/>
-          <w:color w:val="2B2B2B"/>
-          <w:sz w:val="19"/>
-          <w:szCs w:val="19"/>
-        </w:rPr>
-        <w:t xml:space="preserve">Conducted keyword research and analysis to identify relevant search terms, optimising website content, meta tags and link structures for improved organic search rankings and visibility</w:t>
-      </w:r>
-    </w:p>
-    <w:p>
-      <w:pPr>
-        <w:pStyle w:val="ListParagraph"/>
-        <w:numPr>
-          <w:ilvl w:val="0"/>
-          <w:numId w:val="1"/>
-        </w:numPr>
-        <w:spacing w:after="50"/>
-      </w:pPr>
-      <w:r>
-        <w:rPr>
-          <w:rFonts w:ascii="Calibri" w:cs="Calibri" w:eastAsia="Calibri" w:hAnsi="Calibri"/>
-          <w:color w:val="2B2B2B"/>
-          <w:sz w:val="19"/>
-          <w:szCs w:val="19"/>
-        </w:rPr>
-        <w:t xml:space="preserve">Developed brand strategy and positioning for clients, translating business goals into channel-level messaging and creative direction</w:t>
-      </w:r>
-    </w:p>
-    <w:p>
-      <w:pPr>
-        <w:pStyle w:val="ListParagraph"/>
-        <w:numPr>
-          <w:ilvl w:val="0"/>
-          <w:numId w:val="1"/>
-        </w:numPr>
-        <w:spacing w:after="50"/>
-      </w:pPr>
-      <w:r>
-        <w:rPr>
-          <w:rFonts w:ascii="Calibri" w:cs="Calibri" w:eastAsia="Calibri" w:hAnsi="Calibri"/>
-          <w:color w:val="2B2B2B"/>
-          <w:sz w:val="19"/>
-          <w:szCs w:val="19"/>
-        </w:rPr>
-        <w:t xml:space="preserve">Planned and produced digital marketing media across client channels — social posts, ad creative and landing page copy</w:t>
-      </w:r>
-    </w:p>
-    <w:p>
-      <w:pPr>
-        <w:pStyle w:val="ListParagraph"/>
-        <w:numPr>
-          <w:ilvl w:val="0"/>
-          <w:numId w:val="1"/>
-        </w:numPr>
-        <w:spacing w:after="50"/>
-      </w:pPr>
-      <w:r>
-        <w:rPr>
-          <w:rFonts w:ascii="Calibri" w:cs="Calibri" w:eastAsia="Calibri" w:hAnsi="Calibri"/>
-          <w:color w:val="2B2B2B"/>
-          <w:sz w:val="19"/>
-          <w:szCs w:val="19"/>
-        </w:rPr>
-        <w:t xml:space="preserve">Managed day-to-day social publishing and community engagement against a consistent content calendar</w:t>
-      </w:r>
-    </w:p>
-    <w:p>
-      <w:pPr>
-        <w:pStyle w:val="ListParagraph"/>
-        <w:numPr>
-          <w:ilvl w:val="0"/>
-          <w:numId w:val="1"/>
-        </w:numPr>
-        <w:spacing w:after="50"/>
-      </w:pPr>
-      <w:r>
-        <w:rPr>
-          <w:rFonts w:ascii="Calibri" w:cs="Calibri" w:eastAsia="Calibri" w:hAnsi="Calibri"/>
-          <w:color w:val="2B2B2B"/>
-          <w:sz w:val="19"/>
-          <w:szCs w:val="19"/>
-        </w:rPr>
-        <w:t xml:space="preserve">Ran competitor and audience research to identify content gaps and positioning opportunities</w:t>
-      </w:r>
-    </w:p>
-    <w:p>
-      <w:pPr>
-        <w:pStyle w:val="ListParagraph"/>
-        <w:numPr>
-          <w:ilvl w:val="0"/>
-          <w:numId w:val="1"/>
-        </w:numPr>
-        <w:spacing w:after="50"/>
-      </w:pPr>
-      <w:r>
-        <w:rPr>
-          <w:rFonts w:ascii="Calibri" w:cs="Calibri" w:eastAsia="Calibri" w:hAnsi="Calibri"/>
-          <w:color w:val="2B2B2B"/>
-          <w:sz w:val="19"/>
-          <w:szCs w:val="19"/>
-        </w:rPr>
-        <w:t xml:space="preserve">Set up campaign tracking and reported on traffic, engagement and conversion performance to steer the next cycle</w:t>
+        <w:t xml:space="preserve">PT Sahabat Maju Jaya · Jakarta, Indonesia · On-site</w:t>
+      </w:r>
+    </w:p>
+    <w:p>
+      <w:pPr>
+        <w:pStyle w:val="ListParagraph"/>
+        <w:numPr>
+          <w:ilvl w:val="0"/>
+          <w:numId w:val="1"/>
+        </w:numPr>
+        <w:spacing w:after="50"/>
+      </w:pPr>
+      <w:r>
+        <w:rPr>
+          <w:rFonts w:ascii="Calibri" w:cs="Calibri" w:eastAsia="Calibri" w:hAnsi="Calibri"/>
+          <w:color w:val="2B2B2B"/>
+          <w:sz w:val="19"/>
+          <w:szCs w:val="19"/>
+        </w:rPr>
+        <w:t xml:space="preserve">Assisted the Vice President in designing and implementing strategic initiatives to meet company goals and objectives</w:t>
+      </w:r>
+    </w:p>
+    <w:p>
+      <w:pPr>
+        <w:pStyle w:val="ListParagraph"/>
+        <w:numPr>
+          <w:ilvl w:val="0"/>
+          <w:numId w:val="1"/>
+        </w:numPr>
+        <w:spacing w:after="50"/>
+      </w:pPr>
+      <w:r>
+        <w:rPr>
+          <w:rFonts w:ascii="Calibri" w:cs="Calibri" w:eastAsia="Calibri" w:hAnsi="Calibri"/>
+          <w:color w:val="2B2B2B"/>
+          <w:sz w:val="19"/>
+          <w:szCs w:val="19"/>
+        </w:rPr>
+        <w:t xml:space="preserve">Prepared business and financial reports, briefing materials and presentation decks for management review</w:t>
+      </w:r>
+    </w:p>
+    <w:p>
+      <w:pPr>
+        <w:pStyle w:val="ListParagraph"/>
+        <w:numPr>
+          <w:ilvl w:val="0"/>
+          <w:numId w:val="1"/>
+        </w:numPr>
+        <w:spacing w:after="50"/>
+      </w:pPr>
+      <w:r>
+        <w:rPr>
+          <w:rFonts w:ascii="Calibri" w:cs="Calibri" w:eastAsia="Calibri" w:hAnsi="Calibri"/>
+          <w:color w:val="2B2B2B"/>
+          <w:sz w:val="19"/>
+          <w:szCs w:val="19"/>
+        </w:rPr>
+        <w:t xml:space="preserve">Handled bookkeeping — recorded transactions, reconciled accounts and supported monthly and year-end financial reporting</w:t>
+      </w:r>
+    </w:p>
+    <w:p>
+      <w:pPr>
+        <w:pStyle w:val="ListParagraph"/>
+        <w:numPr>
+          <w:ilvl w:val="0"/>
+          <w:numId w:val="1"/>
+        </w:numPr>
+        <w:spacing w:after="50"/>
+      </w:pPr>
+      <w:r>
+        <w:rPr>
+          <w:rFonts w:ascii="Calibri" w:cs="Calibri" w:eastAsia="Calibri" w:hAnsi="Calibri"/>
+          <w:color w:val="2B2B2B"/>
+          <w:sz w:val="19"/>
+          <w:szCs w:val="19"/>
+        </w:rPr>
+        <w:t xml:space="preserve">Coordinated across departments to track progress against targets and escalated blockers to the Vice President</w:t>
+      </w:r>
+    </w:p>
+    <w:p>
+      <w:pPr>
+        <w:pStyle w:val="ListParagraph"/>
+        <w:numPr>
+          <w:ilvl w:val="0"/>
+          <w:numId w:val="1"/>
+        </w:numPr>
+        <w:spacing w:after="50"/>
+      </w:pPr>
+      <w:r>
+        <w:rPr>
+          <w:rFonts w:ascii="Calibri" w:cs="Calibri" w:eastAsia="Calibri" w:hAnsi="Calibri"/>
+          <w:color w:val="2B2B2B"/>
+          <w:sz w:val="19"/>
+          <w:szCs w:val="19"/>
+        </w:rPr>
+        <w:t xml:space="preserve">Supported budgeting and cost monitoring, flagging variances against plan</w:t>
+      </w:r>
+    </w:p>
+    <w:p>
+      <w:pPr>
+        <w:pStyle w:val="ListParagraph"/>
+        <w:numPr>
+          <w:ilvl w:val="0"/>
+          <w:numId w:val="1"/>
+        </w:numPr>
+        <w:spacing w:after="50"/>
+      </w:pPr>
+      <w:r>
+        <w:rPr>
+          <w:rFonts w:ascii="Calibri" w:cs="Calibri" w:eastAsia="Calibri" w:hAnsi="Calibri"/>
+          <w:color w:val="2B2B2B"/>
+          <w:sz w:val="19"/>
+          <w:szCs w:val="19"/>
+        </w:rPr>
+        <w:t xml:space="preserve">Maintained company documentation and administrative records, keeping internal reporting and filings current</w:t>
+      </w:r>
+    </w:p>
+    <w:p>
+      <w:pPr>
+        <w:pBdr>
+          <w:bottom w:val="single" w:color="B8B8B8" w:sz="6" w:space="3"/>
+        </w:pBdr>
+        <w:spacing w:after="110" w:before="250"/>
+      </w:pPr>
+      <w:r>
+        <w:rPr>
+          <w:rFonts w:ascii="Calibri" w:cs="Calibri" w:eastAsia="Calibri" w:hAnsi="Calibri"/>
+          <w:color w:val="6B6B6B"/>
+          <w:spacing w:val="60"/>
+          <w:sz w:val="17"/>
+          <w:szCs w:val="17"/>
+        </w:rPr>
+        <w:t xml:space="preserve">EDUCATION</w:t>
       </w:r>
     </w:p>
     <w:p>
@@ -795,7 +797,7 @@
         <w:tabs>
           <w:tab w:val="right" w:pos="10240"/>
         </w:tabs>
-        <w:spacing w:after="0" w:before="160"/>
+        <w:spacing w:after="0"/>
       </w:pPr>
       <w:r>
         <w:rPr>
@@ -806,7 +808,7 @@
           <w:sz w:val="20"/>
           <w:szCs w:val="20"/>
         </w:rPr>
-        <w:t xml:space="preserve">Assistant Vice President</w:t>
+        <w:t xml:space="preserve">Bachelor’s Degree, Business, Management &amp; Marketing</w:t>
       </w:r>
       <w:r>
         <w:rPr>
@@ -815,7 +817,7 @@
           <w:sz w:val="18"/>
           <w:szCs w:val="18"/>
         </w:rPr>
-        <w:t xml:space="preserve">	Jun 2022 – Jan 2023</w:t>
+        <w:t xml:space="preserve">	2021 – 2024</w:t>
       </w:r>
     </w:p>
     <w:p>
@@ -829,277 +831,7 @@
           <w:sz w:val="18"/>
           <w:szCs w:val="18"/>
         </w:rPr>
-        <w:t xml:space="preserve">PT Sahabat Maju Jaya · Jakarta, Indonesia · On-site</w:t>
-      </w:r>
-    </w:p>
-    <w:p>
-      <w:pPr>
-        <w:pStyle w:val="ListParagraph"/>
-        <w:numPr>
-          <w:ilvl w:val="0"/>
-          <w:numId w:val="1"/>
-        </w:numPr>
-        <w:spacing w:after="50"/>
-      </w:pPr>
-      <w:r>
-        <w:rPr>
-          <w:rFonts w:ascii="Calibri" w:cs="Calibri" w:eastAsia="Calibri" w:hAnsi="Calibri"/>
-          <w:color w:val="2B2B2B"/>
-          <w:sz w:val="19"/>
-          <w:szCs w:val="19"/>
-        </w:rPr>
-        <w:t xml:space="preserve">Assisted the Vice President in designing and implementing strategic initiatives to meet company goals and objectives</w:t>
-      </w:r>
-    </w:p>
-    <w:p>
-      <w:pPr>
-        <w:pStyle w:val="ListParagraph"/>
-        <w:numPr>
-          <w:ilvl w:val="0"/>
-          <w:numId w:val="1"/>
-        </w:numPr>
-        <w:spacing w:after="50"/>
-      </w:pPr>
-      <w:r>
-        <w:rPr>
-          <w:rFonts w:ascii="Calibri" w:cs="Calibri" w:eastAsia="Calibri" w:hAnsi="Calibri"/>
-          <w:color w:val="2B2B2B"/>
-          <w:sz w:val="19"/>
-          <w:szCs w:val="19"/>
-        </w:rPr>
-        <w:t xml:space="preserve">Prepared business and financial reports, briefing materials and presentation decks for management review</w:t>
-      </w:r>
-    </w:p>
-    <w:p>
-      <w:pPr>
-        <w:pStyle w:val="ListParagraph"/>
-        <w:numPr>
-          <w:ilvl w:val="0"/>
-          <w:numId w:val="1"/>
-        </w:numPr>
-        <w:spacing w:after="50"/>
-      </w:pPr>
-      <w:r>
-        <w:rPr>
-          <w:rFonts w:ascii="Calibri" w:cs="Calibri" w:eastAsia="Calibri" w:hAnsi="Calibri"/>
-          <w:color w:val="2B2B2B"/>
-          <w:sz w:val="19"/>
-          <w:szCs w:val="19"/>
-        </w:rPr>
-        <w:t xml:space="preserve">Handled bookkeeping — recorded transactions, reconciled accounts and supported monthly and year-end financial reporting</w:t>
-      </w:r>
-    </w:p>
-    <w:p>
-      <w:pPr>
-        <w:pStyle w:val="ListParagraph"/>
-        <w:numPr>
-          <w:ilvl w:val="0"/>
-          <w:numId w:val="1"/>
-        </w:numPr>
-        <w:spacing w:after="50"/>
-      </w:pPr>
-      <w:r>
-        <w:rPr>
-          <w:rFonts w:ascii="Calibri" w:cs="Calibri" w:eastAsia="Calibri" w:hAnsi="Calibri"/>
-          <w:color w:val="2B2B2B"/>
-          <w:sz w:val="19"/>
-          <w:szCs w:val="19"/>
-        </w:rPr>
-        <w:t xml:space="preserve">Coordinated across departments to track progress against targets and escalated blockers to the Vice President</w:t>
-      </w:r>
-    </w:p>
-    <w:p>
-      <w:pPr>
-        <w:pStyle w:val="ListParagraph"/>
-        <w:numPr>
-          <w:ilvl w:val="0"/>
-          <w:numId w:val="1"/>
-        </w:numPr>
-        <w:spacing w:after="50"/>
-      </w:pPr>
-      <w:r>
-        <w:rPr>
-          <w:rFonts w:ascii="Calibri" w:cs="Calibri" w:eastAsia="Calibri" w:hAnsi="Calibri"/>
-          <w:color w:val="2B2B2B"/>
-          <w:sz w:val="19"/>
-          <w:szCs w:val="19"/>
-        </w:rPr>
-        <w:t xml:space="preserve">Supported budgeting and cost monitoring, flagging variances against plan</w:t>
-      </w:r>
-    </w:p>
-    <w:p>
-      <w:pPr>
-        <w:pStyle w:val="ListParagraph"/>
-        <w:numPr>
-          <w:ilvl w:val="0"/>
-          <w:numId w:val="1"/>
-        </w:numPr>
-        <w:spacing w:after="50"/>
-      </w:pPr>
-      <w:r>
-        <w:rPr>
-          <w:rFonts w:ascii="Calibri" w:cs="Calibri" w:eastAsia="Calibri" w:hAnsi="Calibri"/>
-          <w:color w:val="2B2B2B"/>
-          <w:sz w:val="19"/>
-          <w:szCs w:val="19"/>
-        </w:rPr>
-        <w:t xml:space="preserve">Maintained company documentation and administrative records, keeping internal reporting and filings current</w:t>
-      </w:r>
-    </w:p>
-    <w:p>
-      <w:pPr>
-        <w:tabs>
-          <w:tab w:val="right" w:pos="10240"/>
-        </w:tabs>
-        <w:spacing w:after="0" w:before="160"/>
-      </w:pPr>
-      <w:r>
-        <w:rPr>
-          <w:rFonts w:ascii="Calibri" w:cs="Calibri" w:eastAsia="Calibri" w:hAnsi="Calibri"/>
-          <w:b/>
-          <w:bCs/>
-          <w:color w:val="000000"/>
-          <w:sz w:val="20"/>
-          <w:szCs w:val="20"/>
-        </w:rPr>
-        <w:t xml:space="preserve">Financial Services Consultant</w:t>
-      </w:r>
-      <w:r>
-        <w:rPr>
-          <w:rFonts w:ascii="Calibri" w:cs="Calibri" w:eastAsia="Calibri" w:hAnsi="Calibri"/>
-          <w:color w:val="6B6B6B"/>
-          <w:sz w:val="18"/>
-          <w:szCs w:val="18"/>
-        </w:rPr>
-        <w:t xml:space="preserve">	Mar 2022 – Jun 2022</w:t>
-      </w:r>
-    </w:p>
-    <w:p>
-      <w:pPr>
-        <w:spacing w:after="65"/>
-      </w:pPr>
-      <w:r>
-        <w:rPr>
-          <w:rFonts w:ascii="Calibri" w:cs="Calibri" w:eastAsia="Calibri" w:hAnsi="Calibri"/>
-          <w:color w:val="5A5A5A"/>
-          <w:sz w:val="18"/>
-          <w:szCs w:val="18"/>
-        </w:rPr>
-        <w:t xml:space="preserve">PT Kontak Perkasa Futures · Indonesia · On-site</w:t>
-      </w:r>
-    </w:p>
-    <w:p>
-      <w:pPr>
-        <w:pStyle w:val="ListParagraph"/>
-        <w:numPr>
-          <w:ilvl w:val="0"/>
-          <w:numId w:val="1"/>
-        </w:numPr>
-        <w:spacing w:after="50"/>
-      </w:pPr>
-      <w:r>
-        <w:rPr>
-          <w:rFonts w:ascii="Calibri" w:cs="Calibri" w:eastAsia="Calibri" w:hAnsi="Calibri"/>
-          <w:color w:val="2B2B2B"/>
-          <w:sz w:val="19"/>
-          <w:szCs w:val="19"/>
-        </w:rPr>
-        <w:t xml:space="preserve">Built and maintained client relationships, sustaining satisfaction and retention through proactive communication and responsive support</w:t>
-      </w:r>
-    </w:p>
-    <w:p>
-      <w:pPr>
-        <w:pStyle w:val="ListParagraph"/>
-        <w:numPr>
-          <w:ilvl w:val="0"/>
-          <w:numId w:val="1"/>
-        </w:numPr>
-        <w:spacing w:after="50"/>
-      </w:pPr>
-      <w:r>
-        <w:rPr>
-          <w:rFonts w:ascii="Calibri" w:cs="Calibri" w:eastAsia="Calibri" w:hAnsi="Calibri"/>
-          <w:color w:val="2B2B2B"/>
-          <w:sz w:val="19"/>
-          <w:szCs w:val="19"/>
-        </w:rPr>
-        <w:t xml:space="preserve">Advised clients on financial products and investment options, assessing risk profile and objectives before recommending a strategy</w:t>
-      </w:r>
-    </w:p>
-    <w:p>
-      <w:pPr>
-        <w:pStyle w:val="ListParagraph"/>
-        <w:numPr>
-          <w:ilvl w:val="0"/>
-          <w:numId w:val="1"/>
-        </w:numPr>
-        <w:spacing w:after="50"/>
-      </w:pPr>
-      <w:r>
-        <w:rPr>
-          <w:rFonts w:ascii="Calibri" w:cs="Calibri" w:eastAsia="Calibri" w:hAnsi="Calibri"/>
-          <w:color w:val="2B2B2B"/>
-          <w:sz w:val="19"/>
-          <w:szCs w:val="19"/>
-        </w:rPr>
-        <w:t xml:space="preserve">Explained product mechanics, cost structures and risk exposure so clients could make informed decisions</w:t>
-      </w:r>
-    </w:p>
-    <w:p>
-      <w:pPr>
-        <w:pStyle w:val="ListParagraph"/>
-        <w:numPr>
-          <w:ilvl w:val="0"/>
-          <w:numId w:val="1"/>
-        </w:numPr>
-        <w:spacing w:after="50"/>
-      </w:pPr>
-      <w:r>
-        <w:rPr>
-          <w:rFonts w:ascii="Calibri" w:cs="Calibri" w:eastAsia="Calibri" w:hAnsi="Calibri"/>
-          <w:color w:val="2B2B2B"/>
-          <w:sz w:val="19"/>
-          <w:szCs w:val="19"/>
-        </w:rPr>
-        <w:t xml:space="preserve">Delivered regular market updates and portfolio reviews, adjusting recommendations as conditions changed</w:t>
-      </w:r>
-    </w:p>
-    <w:p>
-      <w:pPr>
-        <w:pStyle w:val="ListParagraph"/>
-        <w:numPr>
-          <w:ilvl w:val="0"/>
-          <w:numId w:val="1"/>
-        </w:numPr>
-        <w:spacing w:after="50"/>
-      </w:pPr>
-      <w:r>
-        <w:rPr>
-          <w:rFonts w:ascii="Calibri" w:cs="Calibri" w:eastAsia="Calibri" w:hAnsi="Calibri"/>
-          <w:color w:val="2B2B2B"/>
-          <w:sz w:val="19"/>
-          <w:szCs w:val="19"/>
-        </w:rPr>
-        <w:t xml:space="preserve">Prospected and onboarded new clients, guiding them through account opening, documentation and compliance requirements</w:t>
-      </w:r>
-    </w:p>
-    <w:p>
-      <w:pPr>
-        <w:pStyle w:val="ListParagraph"/>
-        <w:numPr>
-          <w:ilvl w:val="0"/>
-          <w:numId w:val="1"/>
-        </w:numPr>
-        <w:spacing w:after="50"/>
-      </w:pPr>
-      <w:r>
-        <w:rPr>
-          <w:rFonts w:ascii="Calibri" w:cs="Calibri" w:eastAsia="Calibri" w:hAnsi="Calibri"/>
-          <w:color w:val="2B2B2B"/>
-          <w:sz w:val="19"/>
-          <w:szCs w:val="19"/>
-        </w:rPr>
-        <w:t xml:space="preserve">Worked within regulatory and internal compliance requirements across all client-facing activity</w:t>
+        <w:t xml:space="preserve">Bunda Mulia University · Jakarta, Indonesia · GPA 3.50 / 4.00</w:t>
       </w:r>
     </w:p>
     <w:p>
@@ -1117,67 +849,37 @@
           <w:sz w:val="17"/>
           <w:szCs w:val="17"/>
         </w:rPr>
-        <w:t xml:space="preserve">EDUCATION</w:t>
-      </w:r>
-    </w:p>
-    <w:p>
-      <w:pPr>
-        <w:tabs>
-          <w:tab w:val="right" w:pos="10240"/>
-        </w:tabs>
-        <w:spacing w:after="0"/>
+        <w:t xml:space="preserve">SKILLS</w:t>
+      </w:r>
+    </w:p>
+    <w:p>
+      <w:pPr>
+        <w:pStyle w:val="ListParagraph"/>
+        <w:numPr>
+          <w:ilvl w:val="0"/>
+          <w:numId w:val="1"/>
+        </w:numPr>
+        <w:spacing w:after="50"/>
       </w:pPr>
       <w:r>
         <w:rPr>
           <w:rFonts w:ascii="Calibri" w:cs="Calibri" w:eastAsia="Calibri" w:hAnsi="Calibri"/>
           <w:b/>
           <w:bCs/>
-          <w:color w:val="000000"/>
-          <w:sz w:val="20"/>
-          <w:szCs w:val="20"/>
-        </w:rPr>
-        <w:t xml:space="preserve">Bachelor’s Degree, Business, Management &amp; Marketing</w:t>
-      </w:r>
-      <w:r>
-        <w:rPr>
-          <w:rFonts w:ascii="Calibri" w:cs="Calibri" w:eastAsia="Calibri" w:hAnsi="Calibri"/>
-          <w:color w:val="6B6B6B"/>
-          <w:sz w:val="18"/>
-          <w:szCs w:val="18"/>
-        </w:rPr>
-        <w:t xml:space="preserve">	2021 – 2024</w:t>
-      </w:r>
-    </w:p>
-    <w:p>
-      <w:pPr>
-        <w:spacing w:after="65"/>
-      </w:pPr>
-      <w:r>
-        <w:rPr>
-          <w:rFonts w:ascii="Calibri" w:cs="Calibri" w:eastAsia="Calibri" w:hAnsi="Calibri"/>
-          <w:color w:val="5A5A5A"/>
-          <w:sz w:val="18"/>
-          <w:szCs w:val="18"/>
-        </w:rPr>
-        <w:t xml:space="preserve">Bunda Mulia University · Jakarta, Indonesia</w:t>
-      </w:r>
-    </w:p>
-    <w:p>
-      <w:pPr>
-        <w:pBdr>
-          <w:bottom w:val="single" w:color="B8B8B8" w:sz="6" w:space="3"/>
-        </w:pBdr>
-        <w:spacing w:after="110" w:before="250"/>
-      </w:pPr>
-      <w:r>
-        <w:rPr>
-          <w:rFonts w:ascii="Calibri" w:cs="Calibri" w:eastAsia="Calibri" w:hAnsi="Calibri"/>
-          <w:color w:val="6B6B6B"/>
-          <w:spacing w:val="60"/>
-          <w:sz w:val="17"/>
-          <w:szCs w:val="17"/>
-        </w:rPr>
-        <w:t xml:space="preserve">SKILLS</w:t>
+          <w:color w:val="2B2B2B"/>
+          <w:sz w:val="19"/>
+          <w:szCs w:val="19"/>
+        </w:rPr>
+        <w:t xml:space="preserve">Creative direction — </w:t>
+      </w:r>
+      <w:r>
+        <w:rPr>
+          <w:rFonts w:ascii="Calibri" w:cs="Calibri" w:eastAsia="Calibri" w:hAnsi="Calibri"/>
+          <w:color w:val="2B2B2B"/>
+          <w:sz w:val="19"/>
+          <w:szCs w:val="19"/>
+        </w:rPr>
+        <w:t xml:space="preserve">concept development, editorial and visual direction, design systems, storyboarding, directing external editors and production partners, reviewing work to a defined standard</w:t>
       </w:r>
     </w:p>
     <w:p>
@@ -1207,7 +909,7 @@
           <w:sz w:val="19"/>
           <w:szCs w:val="19"/>
         </w:rPr>
-        <w:t xml:space="preserve">editorial systems design, evidence standards and source verification, research synthesis from primary literature, scripting and storyboarding, video production, content design</w:t>
+        <w:t xml:space="preserve">editorial systems design, evidence standards and source verification, research synthesis from primary literature, scripting, video production, content design, copywriting</w:t>
       </w:r>
     </w:p>
     <w:p>
@@ -1258,16 +960,16 @@
           <w:sz w:val="19"/>
           <w:szCs w:val="19"/>
         </w:rPr>
-        <w:t xml:space="preserve">Finance — </w:t>
-      </w:r>
-      <w:r>
-        <w:rPr>
-          <w:rFonts w:ascii="Calibri" w:cs="Calibri" w:eastAsia="Calibri" w:hAnsi="Calibri"/>
-          <w:color w:val="2B2B2B"/>
-          <w:sz w:val="19"/>
-          <w:szCs w:val="19"/>
-        </w:rPr>
-        <w:t xml:space="preserve">technical analysis, fundamental analysis, financial markets research, financial advisory, bookkeeping</w:t>
+        <w:t xml:space="preserve">Tools &amp; production — </w:t>
+      </w:r>
+      <w:r>
+        <w:rPr>
+          <w:rFonts w:ascii="Calibri" w:cs="Calibri" w:eastAsia="Calibri" w:hAnsi="Calibri"/>
+          <w:color w:val="2B2B2B"/>
+          <w:sz w:val="19"/>
+          <w:szCs w:val="19"/>
+        </w:rPr>
+        <w:t xml:space="preserve">social-format design systems, explanatory graphics, bilingual subtitling, CMS-ready HTML publishing, version-controlled content repositories</w:t>
       </w:r>
     </w:p>
     <w:p>
@@ -1288,16 +990,16 @@
           <w:sz w:val="19"/>
           <w:szCs w:val="19"/>
         </w:rPr>
-        <w:t xml:space="preserve">Tools &amp; production — </w:t>
-      </w:r>
-      <w:r>
-        <w:rPr>
-          <w:rFonts w:ascii="Calibri" w:cs="Calibri" w:eastAsia="Calibri" w:hAnsi="Calibri"/>
-          <w:color w:val="2B2B2B"/>
-          <w:sz w:val="19"/>
-          <w:szCs w:val="19"/>
-        </w:rPr>
-        <w:t xml:space="preserve">social-format design systems, explanatory graphics, bilingual subtitling, CMS-ready HTML publishing, version-controlled content repositories</w:t>
+        <w:t xml:space="preserve">Business — </w:t>
+      </w:r>
+      <w:r>
+        <w:rPr>
+          <w:rFonts w:ascii="Calibri" w:cs="Calibri" w:eastAsia="Calibri" w:hAnsi="Calibri"/>
+          <w:color w:val="2B2B2B"/>
+          <w:sz w:val="19"/>
+          <w:szCs w:val="19"/>
+        </w:rPr>
+        <w:t xml:space="preserve">strategic planning support, business and financial reporting, budgeting and cost monitoring, bookkeeping</w:t>
       </w:r>
     </w:p>
     <w:p>
@@ -1328,22 +1030,6 @@
           <w:szCs w:val="19"/>
         </w:rPr>
         <w:t xml:space="preserve">Indonesian (native), English (professional working proficiency)</w:t>
-      </w:r>
-    </w:p>
-    <w:p>
-      <w:pPr>
-        <w:spacing w:after="55"/>
-      </w:pPr>
-      <w:r>
-        <w:rPr>
-          <w:rFonts w:ascii="Calibri" w:cs="Calibri" w:eastAsia="Calibri" w:hAnsi="Calibri"/>
-          <w:i/>
-          <w:iCs/>
-          <w:color w:val="9A9A9A"/>
-          <w:sz w:val="18"/>
-          <w:szCs w:val="18"/>
-        </w:rPr>
-        <w:t xml:space="preserve">Add the software you actually use — editing suite, design tools, analytics platforms, trading platforms.</w:t>
       </w:r>
     </w:p>
     <w:sectPr>

</xml_diff>

<commit_message>
Tambah capaian organik dan akun sosmed ke entri Content Creator
- Naik dari nol ke 1 juta+ engagement lewat konten organik, tanpa iklan
- Brand datang inbound karena gaya konten soft-sell
- Akun Instagram, TikTok, dan YouTube dicantumkan klikabel
- Catat konflik handle Instagram antara resume dan label carousel

Co-Authored-By: Claude Opus 5 <noreply@anthropic.com>
Claude-Session: https://claude.ai/code/session_01DWyspajaqx8W3wFxgo15X2
</commit_message>
<xml_diff>
--- a/cv/Resume - Dustin Wijaya (EN).docx
+++ b/cv/Resume - Dustin Wijaya (EN).docx
@@ -54,7 +54,7 @@
         </w:rPr>
         <w:t xml:space="preserve">   ·   +62 813-1408-5961   ·   Indonesia   ·   </w:t>
       </w:r>
-      <w:hyperlink w:history="1" r:id="rIdbhjgoiy1ecdm71xohn-4v">
+      <w:hyperlink w:history="1" r:id="rId8yyipicdhr3ipk5z6etlu">
         <w:r>
           <w:rPr>
             <w:rFonts w:ascii="Calibri" w:cs="Calibri" w:eastAsia="Calibri" w:hAnsi="Calibri"/>
@@ -96,7 +96,7 @@
           <w:sz w:val="19"/>
           <w:szCs w:val="19"/>
         </w:rPr>
-        <w:t xml:space="preserve">Creative Director at a specialty coffee company, running marketing end to end. Own brand positioning, channel strategy and the full content pipeline from research question to published asset — concepting, scripting, editorial design and direction of external production. Build systems rather than one-off output: a documented evidence standard applied to every published claim, a repeatable script framework, and funnel-mapped programming reviewed weekly against a tracked performance dashboard.</w:t>
+        <w:t xml:space="preserve">Creative Director at a specialty coffee company, running marketing end to end. Grew a personal content account from zero to 1M+ engagements through organic content alone. Own brand positioning, channel strategy and the full content pipeline from research question to published asset — concepting, scripting, editorial design and direction of external production. Build systems rather than one-off output: a documented evidence standard applied to every published claim, a repeatable script framework, and funnel-mapped programming reviewed weekly against a tracked performance dashboard.</w:t>
       </w:r>
     </w:p>
     <w:p>
@@ -407,6 +407,130 @@
     </w:p>
     <w:p>
       <w:pPr>
+        <w:spacing w:after="70"/>
+      </w:pPr>
+      <w:r>
+        <w:rPr>
+          <w:rFonts w:ascii="Calibri" w:cs="Calibri" w:eastAsia="Calibri" w:hAnsi="Calibri"/>
+          <w:color w:val="5A5A5A"/>
+          <w:sz w:val="17"/>
+          <w:szCs w:val="17"/>
+        </w:rPr>
+        <w:t xml:space="preserve">Instagram </w:t>
+      </w:r>
+      <w:hyperlink w:history="1" r:id="rIdoonr0s-xeghkyta6z1hy0">
+        <w:r>
+          <w:rPr>
+            <w:rFonts w:ascii="Calibri" w:cs="Calibri" w:eastAsia="Calibri" w:hAnsi="Calibri"/>
+            <w:color w:val="1155CC"/>
+            <w:sz w:val="17"/>
+            <w:szCs w:val="17"/>
+            <w:u w:val="single"/>
+          </w:rPr>
+          <w:t xml:space="preserve">@dustinwijaya_</w:t>
+        </w:r>
+      </w:hyperlink>
+      <w:r>
+        <w:rPr>
+          <w:rFonts w:ascii="Calibri" w:cs="Calibri" w:eastAsia="Calibri" w:hAnsi="Calibri"/>
+          <w:color w:val="9A9A9A"/>
+          <w:sz w:val="17"/>
+          <w:szCs w:val="17"/>
+        </w:rPr>
+        <w:t xml:space="preserve">   ·   </w:t>
+      </w:r>
+      <w:r>
+        <w:rPr>
+          <w:rFonts w:ascii="Calibri" w:cs="Calibri" w:eastAsia="Calibri" w:hAnsi="Calibri"/>
+          <w:color w:val="5A5A5A"/>
+          <w:sz w:val="17"/>
+          <w:szCs w:val="17"/>
+        </w:rPr>
+        <w:t xml:space="preserve">TikTok </w:t>
+      </w:r>
+      <w:hyperlink w:history="1" r:id="rId098o3egdooisunznqdis0">
+        <w:r>
+          <w:rPr>
+            <w:rFonts w:ascii="Calibri" w:cs="Calibri" w:eastAsia="Calibri" w:hAnsi="Calibri"/>
+            <w:color w:val="1155CC"/>
+            <w:sz w:val="17"/>
+            <w:szCs w:val="17"/>
+            <w:u w:val="single"/>
+          </w:rPr>
+          <w:t xml:space="preserve">@dustinwijayaa</w:t>
+        </w:r>
+      </w:hyperlink>
+      <w:r>
+        <w:rPr>
+          <w:rFonts w:ascii="Calibri" w:cs="Calibri" w:eastAsia="Calibri" w:hAnsi="Calibri"/>
+          <w:color w:val="9A9A9A"/>
+          <w:sz w:val="17"/>
+          <w:szCs w:val="17"/>
+        </w:rPr>
+        <w:t xml:space="preserve">   ·   </w:t>
+      </w:r>
+      <w:r>
+        <w:rPr>
+          <w:rFonts w:ascii="Calibri" w:cs="Calibri" w:eastAsia="Calibri" w:hAnsi="Calibri"/>
+          <w:color w:val="5A5A5A"/>
+          <w:sz w:val="17"/>
+          <w:szCs w:val="17"/>
+        </w:rPr>
+        <w:t xml:space="preserve">YouTube </w:t>
+      </w:r>
+      <w:hyperlink w:history="1" r:id="rIdcjpqcd0ujcn-rbohwzp4a">
+        <w:r>
+          <w:rPr>
+            <w:rFonts w:ascii="Calibri" w:cs="Calibri" w:eastAsia="Calibri" w:hAnsi="Calibri"/>
+            <w:color w:val="1155CC"/>
+            <w:sz w:val="17"/>
+            <w:szCs w:val="17"/>
+            <w:u w:val="single"/>
+          </w:rPr>
+          <w:t xml:space="preserve">@dustinwijayaa</w:t>
+        </w:r>
+      </w:hyperlink>
+    </w:p>
+    <w:p>
+      <w:pPr>
+        <w:pStyle w:val="ListParagraph"/>
+        <w:numPr>
+          <w:ilvl w:val="0"/>
+          <w:numId w:val="1"/>
+        </w:numPr>
+        <w:spacing w:after="50"/>
+      </w:pPr>
+      <w:r>
+        <w:rPr>
+          <w:rFonts w:ascii="Calibri" w:cs="Calibri" w:eastAsia="Calibri" w:hAnsi="Calibri"/>
+          <w:color w:val="2B2B2B"/>
+          <w:sz w:val="19"/>
+          <w:szCs w:val="19"/>
+        </w:rPr>
+        <w:t xml:space="preserve">Grew the account from zero to 1M+ engagements through organic content alone, with no paid promotion</w:t>
+      </w:r>
+    </w:p>
+    <w:p>
+      <w:pPr>
+        <w:pStyle w:val="ListParagraph"/>
+        <w:numPr>
+          <w:ilvl w:val="0"/>
+          <w:numId w:val="1"/>
+        </w:numPr>
+        <w:spacing w:after="50"/>
+      </w:pPr>
+      <w:r>
+        <w:rPr>
+          <w:rFonts w:ascii="Calibri" w:cs="Calibri" w:eastAsia="Calibri" w:hAnsi="Calibri"/>
+          <w:color w:val="2B2B2B"/>
+          <w:sz w:val="19"/>
+          <w:szCs w:val="19"/>
+        </w:rPr>
+        <w:t xml:space="preserve">Attracted inbound brand partnership approaches on the strength of that organic reach, with brands citing the account’s soft-sell content style as the fit</w:t>
+      </w:r>
+    </w:p>
+    <w:p>
+      <w:pPr>
         <w:pStyle w:val="ListParagraph"/>
         <w:numPr>
           <w:ilvl w:val="0"/>
@@ -939,7 +1063,7 @@
           <w:sz w:val="19"/>
           <w:szCs w:val="19"/>
         </w:rPr>
-        <w:t xml:space="preserve">brand positioning, channel strategy, campaign planning, funnel-based content programming, SEO and keyword research, on-page optimisation, cross-platform performance analysis</w:t>
+        <w:t xml:space="preserve">organic audience growth, brand positioning, channel strategy, campaign planning, funnel-based content programming, soft-sell and branded content, brand partnerships, SEO and keyword research, cross-platform performance analysis</w:t>
       </w:r>
     </w:p>
     <w:p>

</xml_diff>